<commit_message>
added Nisol Discovery module
</commit_message>
<xml_diff>
--- a/Documents/AI Discovery Workshop/NisolLabs-Discovery-Website-Flow-V1-SRS.docx
+++ b/Documents/AI Discovery Workshop/NisolLabs-Discovery-Website-Flow-V1-SRS.docx
@@ -2154,7 +2154,11 @@
         <w:t>```</w:t>
       </w:r>
     </w:p>
-    <w:p/>
+    <w:p>
+      <w:r>
+        <w:t>Already inserted</w:t>
+      </w:r>
+    </w:p>
     <w:p>
       <w:r>
         <w:t>---</w:t>

</xml_diff>